<commit_message>
Add click-through flow to submissions demo, make resume/letter links visible
Generating submissions now replaces the masterlist view with a results
view and a back link, matching the ISBN/Author Lookup pattern already
used elsewhere in the demo. Also styles the resume and cover letter's
contact links (email, LinkedIn, portfolio) in teal with an underline so
they read as clickable instead of blending into plain text.

Co-Authored-By: Claude Sonnet 5 <noreply@anthropic.com>
</commit_message>
<xml_diff>
--- a/public/Sam_Lappan_Cover_Letter.docx
+++ b/public/Sam_Lappan_Cover_Letter.docx
@@ -82,8 +82,41 @@
           <w:sz w:val="18"/>
           <w:szCs w:val="18"/>
         </w:rPr>
-        <w:t xml:space="preserve">Gosford, Central Coast NSW   ·   0401 443 188   ·   lappansam001@gmail.com   ·   sam-lappan-portfolio.vercel.app</w:t>
-      </w:r>
+        <w:t xml:space="preserve">Gosford, Central Coast NSW   ·   0401 443 188   ·   </w:t>
+      </w:r>
+      <w:hyperlink w:history="1" r:id="rIds8v4n056ubfbapk79evgm">
+        <w:r>
+          <w:rPr>
+            <w:rFonts w:ascii="Arial" w:cs="Arial" w:eastAsia="Arial" w:hAnsi="Arial"/>
+            <w:color w:val="2C6B6A"/>
+            <w:sz w:val="18"/>
+            <w:szCs w:val="18"/>
+            <w:u w:val="single"/>
+          </w:rPr>
+          <w:t xml:space="preserve">lappansam001@gmail.com</w:t>
+        </w:r>
+      </w:hyperlink>
+      <w:r>
+        <w:rPr>
+          <w:rFonts w:ascii="Arial" w:cs="Arial" w:eastAsia="Arial" w:hAnsi="Arial"/>
+          <w:color w:val="4B5563"/>
+          <w:sz w:val="18"/>
+          <w:szCs w:val="18"/>
+        </w:rPr>
+        <w:t xml:space="preserve">   ·   </w:t>
+      </w:r>
+      <w:hyperlink w:history="1" r:id="rIdfbiwbz8qtdfmhiuhsddum">
+        <w:r>
+          <w:rPr>
+            <w:rFonts w:ascii="Arial" w:cs="Arial" w:eastAsia="Arial" w:hAnsi="Arial"/>
+            <w:color w:val="2C6B6A"/>
+            <w:sz w:val="18"/>
+            <w:szCs w:val="18"/>
+            <w:u w:val="single"/>
+          </w:rPr>
+          <w:t xml:space="preserve">sam-lappan-portfolio.vercel.app</w:t>
+        </w:r>
+      </w:hyperlink>
     </w:p>
     <w:p>
       <w:pPr>

</xml_diff>

<commit_message>
Fix language inconsistencies across resume and cover letter
Adds LinkedIn to the cover letter (resume and site already had it),
aligns "two weeks" wording with the site's more careful "the better
part of two weeks" phrasing, and fixes a confusing resume bullet that
implied the internship came after the warehouse-to-placement move
rather than being the same role.

Co-Authored-By: Claude Sonnet 5 <noreply@anthropic.com>
</commit_message>
<xml_diff>
--- a/public/Sam_Lappan_Cover_Letter.docx
+++ b/public/Sam_Lappan_Cover_Letter.docx
@@ -84,7 +84,7 @@
         </w:rPr>
         <w:t xml:space="preserve">Gosford, Central Coast NSW   ·   0401 443 188   ·   </w:t>
       </w:r>
-      <w:hyperlink w:history="1" r:id="rIds8v4n056ubfbapk79evgm">
+      <w:hyperlink w:history="1" r:id="rIdpmqe7_sfk_s9uywwxvp-l">
         <w:r>
           <w:rPr>
             <w:rFonts w:ascii="Arial" w:cs="Arial" w:eastAsia="Arial" w:hAnsi="Arial"/>
@@ -105,7 +105,28 @@
         </w:rPr>
         <w:t xml:space="preserve">   ·   </w:t>
       </w:r>
-      <w:hyperlink w:history="1" r:id="rIdfbiwbz8qtdfmhiuhsddum">
+      <w:hyperlink w:history="1" r:id="rIdknlw22wx_e5ujrsjegpd_">
+        <w:r>
+          <w:rPr>
+            <w:rFonts w:ascii="Arial" w:cs="Arial" w:eastAsia="Arial" w:hAnsi="Arial"/>
+            <w:color w:val="2C6B6A"/>
+            <w:sz w:val="18"/>
+            <w:szCs w:val="18"/>
+            <w:u w:val="single"/>
+          </w:rPr>
+          <w:t xml:space="preserve">linkedin.com/in/sam-lappan-325023242</w:t>
+        </w:r>
+      </w:hyperlink>
+      <w:r>
+        <w:rPr>
+          <w:rFonts w:ascii="Arial" w:cs="Arial" w:eastAsia="Arial" w:hAnsi="Arial"/>
+          <w:color w:val="4B5563"/>
+          <w:sz w:val="18"/>
+          <w:szCs w:val="18"/>
+        </w:rPr>
+        <w:t xml:space="preserve">   ·   </w:t>
+      </w:r>
+      <w:hyperlink w:history="1" r:id="rIdejnbhe2umejtqovfdlht2">
         <w:r>
           <w:rPr>
             <w:rFonts w:ascii="Arial" w:cs="Arial" w:eastAsia="Arial" w:hAnsi="Arial"/>
@@ -272,7 +293,7 @@
           <w:sz w:val="21"/>
           <w:szCs w:val="21"/>
         </w:rPr>
-        <w:t xml:space="preserve">Over the past year I've designed and shipped four full-stack systems now used across Scholastic's Australian and New Zealand operations, including a custom CMS with AI-assisted page generation, a retail submission tool that turned a two-week manual process into a one-minute task, a toy safety compliance checker, and a travel booking and charge management tool. I own each system end to end, from database schema through to deployment, and I've led security remediation work across production apps.</w:t>
+        <w:t xml:space="preserve">Over the past year I've designed and shipped four full-stack systems now used across Scholastic's Australian and New Zealand operations, including a custom CMS with AI-assisted page generation, a retail submission tool that turned the better part of two weeks of manual work into a one-minute task, a toy safety compliance checker, and a travel booking and charge management tool. I own each system end to end, from database schema through to deployment, and I've led security remediation work across production apps.</w:t>
       </w:r>
     </w:p>
     <w:p>

</xml_diff>